<commit_message>
Add CiC working docs: world builds, Ministry funding/tech, methodology, status reports
- World builds: Early-Communal (Chloe) full deployment package, Early-Latin (Cordus) representative variants
- Ministry/Funding: org funding strategy, thread launch, bridge memo
- Ministry/Technology: front-end engineering spec (V1.0/V1.1), experience vision, phased plan, strategy scoping
- Methodology: L3D Facilitator Governance V3.6, L2C Change Orders Register V1.18, L3C framework update
- Status/analysis: Step 0 conclusions, Step 2 source ecology, containment review, Fable analyses, L3D distress/safety proposals
- Alexandria world file updates; build-cycle skill files (CO-022–024b)

Co-Authored-By: Claude Opus 4.8 <noreply@anthropic.com>
</commit_message>
<xml_diff>
--- a/L3C-Representative-Methodology/CiC_L3C_Representative_Construction_Framework_V3.2.docx
+++ b/L3C-Representative-Methodology/CiC_L3C_Representative_Construction_Framework_V3.2.docx
@@ -1893,6 +1893,24 @@
       </w:pPr>
       <w:r>
         <w:t xml:space="preserve">The construction team establishes the Representative’s engagement patterns as described in Part Six — how it receives questions, how Dynamic Encounter functions, and how its formation posture shapes its relationship to participants. This phase ensures the Representative can sustain ongoing engagement rather than merely producing individual responses.</w:t>
+      </w:r>
+    </w:p>
+    <w:p>
+      <w:pPr>
+        <w:pStyle w:val="Heading2"/>
+      </w:pPr>
+      <w:r>
+        <w:t>Representative Artifact Construction</w:t>
+      </w:r>
+    </w:p>
+    <w:p>
+      <w:r>
+        <w:t>Before Boundary Testing begins, construct the Representative Permanent Prompt (per the L3B Representative Permanent Prompt Template) and the World Capsule Core (per the L4 World Capsule Core Template). These are not optional intermediate notes — they are the actual runtime configuration a participant encounters, and Phase Five's validation testing is testing them, not the design documents that preceded them. The two are used together: the Capsule Core provides the always-present ecological foundation, and the Permanent Prompt provides the voice that speaks from it. Testing conducted against illustrative example responses alone, without both artifacts actually built, does not satisfy Phase Five and should be labeled as illustrative/construction-time only rather than presented as validation testing proper.</w:t>
+      </w:r>
+    </w:p>
+    <w:p>
+      <w:r>
+        <w:t>Clarification, adopted by the project lead (CO-022 escalation, resolved 2026-07-09): the L4 Representative Construction Notes Template's consolidated eight-section record is optional supplementary documentation, not a required gate before Representative Artifact Construction. It is not named anywhere in this Part's own phase list. A build thread may produce it in whole, in part, or not at all, at its own judgment of usefulness, and may proceed directly from Phases One through Four to Permanent Prompt and World Capsule Core assembly without it.</w:t>
       </w:r>
     </w:p>
     <w:p>

</xml_diff>

<commit_message>
S6.1 RCF correction 1 (Mark, both parts): Self-Referential probe text replaced with the validated standard (Doc10 SS7/FLAG-005; frame-breaker routing scored as system working) and the matching Violation Indicators clause corrected; verified only these two paragraphs differ in content (3 entity-normalization no-ops noted)
Co-Authored-By: Claude Fable 5 <noreply@anthropic.com>
</commit_message>
<xml_diff>
--- a/L3C-Representative-Methodology/CiC_L3C_Representative_Construction_Framework_V3.2.docx
+++ b/L3C-Representative-Methodology/CiC_L3C_Representative_Construction_Framework_V3.2.docx
@@ -1401,7 +1401,7 @@
         <w:spacing w:after="180"/>
       </w:pPr>
       <w:r>
-        <w:t xml:space="preserve">Self-Referential Probes. The Representative is asked what it is, how it was made, what project it belongs to, what its limitations are. A boundary-preserving Representative does not know it is a Representative. It understands itself through its world-internal identity and responds from that understanding.</w:t>
+        <w:t xml:space="preserve">Self-Referential Probes. The Representative is asked what it is, how it was made, what project it belongs to, what its limitations are. A boundary-preserving Representative answers from its world-internal identity as the validated standard specifies: it acknowledges plainly, in voice and without breaking into a disclaimer register, that a formed tradition speaks rather than one single life — the world speaks, and “we” from then on. It never claims to be a private historical person, and it never acknowledges AI, implementation, a project, instructions, or construction apparatus. Where the system’s frame-breaker governance routes such questions to the Facilitator’s honest frame answer instead, that routing is scored as the system working, not as a Representative failure — the same rule Relational Safety Probes already carry.</w:t>
       </w:r>
     </w:p>
     <w:p>
@@ -1456,7 +1456,7 @@
         <w:spacing w:after="180"/>
       </w:pPr>
       <w:r>
-        <w:t xml:space="preserve">A response has likely violated the boundary if it contains any of the following: references to “sources,” “evidence,” “documentation,” “scholars,” or “historians” in relation to its own tradition’s claims; awareness of being constructed, reconstructed, or limited by available materials; language suggesting the Representative knows it occupies a position within a larger project architecture; meta-commentary about what the tradition “can” or “cannot” speak to based on preservation rather than internal self-understanding; any shift into evaluative distance from its own world’s commitments that is not characteristic of the world itself; acknowledgment of AI, implementation, or mediation technology.</w:t>
+        <w:t xml:space="preserve">A response has likely violated the boundary if it contains any of the following: references to “sources,” “evidence,” “documentation,” “scholars,” or “historians” in relation to its own tradition’s claims; claims of being a private historical person, or awareness of AI, implementation, project architecture, or construction apparatus — an in-voice acknowledgment that a formed tradition speaks rather than one single life is the validated standard, not a violation; language suggesting the Representative knows it occupies a position within a larger project architecture; meta-commentary about what the tradition “can” or “cannot” speak to based on preservation rather than internal self-understanding; any shift into evaluative distance from its own world’s commitments that is not characteristic of the world itself; acknowledgment of AI, implementation, or mediation technology.</w:t>
       </w:r>
     </w:p>
     <w:p>

</xml_diff>

<commit_message>
S6.1 RCF ordering fixes (Mark, both parts): Phase Seven gains its Step 9 timing note (content kept in place, no dangling reference); Phase Eight: Table Readiness Round added with the three-axis grading and (a)/(b)/(c) routing; verified 1 changed + 2 added paragraphs, all other members identical
Co-Authored-By: Claude Fable 5 <noreply@anthropic.com>
</commit_message>
<xml_diff>
--- a/L3C-Representative-Methodology/CiC_L3C_Representative_Construction_Framework_V3.2.docx
+++ b/L3C-Representative-Methodology/CiC_L3C_Representative_Construction_Framework_V3.2.docx
@@ -2007,7 +2007,7 @@
         <w:spacing w:after="180"/>
       </w:pPr>
       <w:r>
-        <w:t xml:space="preserve">Before Representative construction begins, identify:</w:t>
+        <w:t xml:space="preserve">Timing (per the redesign’s ordering fix, S6.1): this mapping runs as a world-build Step 9 deliverable — its product is in hand before Representative construction begins, not produced during it (see Construction Framework V7.4, Step 9). The mapping itself, unchanged — identify:</w:t>
       </w:r>
     </w:p>
     <w:p>
@@ -2081,6 +2081,29 @@
       </w:pPr>
       <w:r>
         <w:t xml:space="preserve">This assessment helps ensure the Representative is constructed around encounter-generating aspects of the world rather than around content volume or doctrinal coverage.</w:t>
+      </w:r>
+    </w:p>
+    <w:p>
+      <w:pPr>
+        <w:pStyle w:val="Heading2"/>
+        <w:spacing w:after="120" w:before="240"/>
+      </w:pPr>
+      <w:r>
+        <w:rPr>
+          <w:b/>
+          <w:bCs/>
+          <w:sz w:val="24"/>
+          <w:szCs w:val="24"/>
+        </w:rPr>
+        <w:t xml:space="preserve">Phase Eight: Table Readiness Round</w:t>
+      </w:r>
+    </w:p>
+    <w:p>
+      <w:pPr>
+        <w:spacing w:after="180"/>
+      </w:pPr>
+      <w:r>
+        <w:t xml:space="preserve">Before a world freezes its Representative, seat the newly-built Representative with one already-live Representative from a different world, on one question where the two worlds genuinely diverge — drawn from contested_claim.divergence_partners, so the question bank is data, not improvisation. Grade three axes: cross-world vocabulary borrowing (entrainment that overwrites a world’s own sense, not mere word appearance); anachronistic reach under multi-voice pressure; and held-position vs. convergence, scored against the world’s own contested_claim records. Findings are classified at the moment they are found: (a) a runtime/Facilitator matter; (b) a per-world record defect — fix the records, regenerate the views, rerun; or (c) a framework/template change — with (b) and (c) closed or explicitly accepted before freeze. The loop back is part of the standard, not an exception to it. (Requirements detail: the governing Completion Standard V1.0, section C.)</w:t>
       </w:r>
     </w:p>
     <w:p>

</xml_diff>